<commit_message>
v122: improve realtime board chat
</commit_message>
<xml_diff>
--- a/supabase/OnlineRepetitor_roadmap.docx
+++ b/supabase/OnlineRepetitor_roadmap.docx
@@ -30,7 +30,7 @@
     </w:p>
     <w:p>
       <w:r>
-        <w:t>Общий прогресс дорожной карты: дальние этапы открыты · v121 — начат серверный чат.</w:t>
+        <w:t>Общий прогресс дорожной карты: ≈86% · v122 — развитие серверного чата</w:t>
       </w:r>
     </w:p>
     <w:p>
@@ -3393,7 +3393,7 @@
           <w:tcPr>
             <w:tcW w:type="dxa" w:w="1656"/>
             <w:vAlign w:val="center"/>
-            <w:shd w:fill="E7E6E6"/>
+            <w:shd w:fill="FFF2CC"/>
           </w:tcPr>
           <w:p>
             <w:r>
@@ -3405,11 +3405,11 @@
           <w:tcPr>
             <w:tcW w:type="dxa" w:w="936"/>
             <w:vAlign w:val="center"/>
-            <w:shd w:fill="E7E6E6"/>
+            <w:shd w:fill="FFF2CC"/>
           </w:tcPr>
           <w:p>
             <w:r>
-              <w:t>55%</w:t>
+              <w:t>72%</w:t>
             </w:r>
           </w:p>
         </w:tc>
@@ -3420,7 +3420,7 @@
           </w:tcPr>
           <w:p>
             <w:r>
-              <w:t>v121</w:t>
+              <w:t>v121–v122</w:t>
             </w:r>
           </w:p>
         </w:tc>
@@ -3747,7 +3747,7 @@
     <w:p/>
     <w:p>
       <w:r>
-        <w:t>Текущий ближайший маршрут: дальние этапы → завершение чата → видеозвонки → платежи и тарифы → ИИ-функции.</w:t>
+        <w:t>Текущий ближайший маршрут: чат → видеозвонки → платежи/тарифы → AI.</w:t>
       </w:r>
     </w:p>
     <w:p>
@@ -3878,6 +3878,17 @@
       </w:r>
       <w:r>
         <w:t>начат полноценный чат внутри доски на серверной базе обсуждений: realtime, ответы, @упоминания, счётчик новых сообщений и адаптивное окно. Добавлен индекс для быстрых хронологических чтений.</w:t>
+      </w:r>
+    </w:p>
+    <w:p>
+      <w:r>
+        <w:rPr>
+          <w:b/>
+        </w:rPr>
+        <w:t xml:space="preserve">v122: </w:t>
+      </w:r>
+      <w:r>
+        <w:t>чат вынесен в верхнюю панель доски, добавлен счётчик новых сообщений и мобильная адаптация; SQL гарантирует публикацию board_comments в Supabase Realtime.</w:t>
       </w:r>
     </w:p>
     <w:sectPr>

</xml_diff>

<commit_message>
v123: add persistent direct teacher student chat
</commit_message>
<xml_diff>
--- a/supabase/OnlineRepetitor_roadmap.docx
+++ b/supabase/OnlineRepetitor_roadmap.docx
@@ -30,7 +30,7 @@
     </w:p>
     <w:p>
       <w:r>
-        <w:t>Общий прогресс дорожной карты: ≈86% · v122 — развитие серверного чата</w:t>
+        <w:t>Общий прогресс дорожной карты: ≈87% · v123 — личные сообщения вне открытой доски</w:t>
       </w:r>
     </w:p>
     <w:p>
@@ -3385,7 +3385,7 @@
           </w:tcPr>
           <w:p>
             <w:r>
-              <w:t>Чат преподаватель ↔ ученик внутри доски/занятия: серверные сообщения, ответы, @упоминания, realtime и счётчик новых сообщений. Следом — общий чат вне занятия.</w:t>
+              <w:t>Личные сообщения преподаватель ↔ ученик работают и внутри доски, и отдельным экраном: история в Supabase, realtime, непрочитанные сообщения и доступ только между участниками общих досок. Осталось довести уведомления и вложения.</w:t>
             </w:r>
           </w:p>
         </w:tc>
@@ -3409,7 +3409,7 @@
           </w:tcPr>
           <w:p>
             <w:r>
-              <w:t>72%</w:t>
+              <w:t>90%</w:t>
             </w:r>
           </w:p>
         </w:tc>
@@ -3420,7 +3420,7 @@
           </w:tcPr>
           <w:p>
             <w:r>
-              <w:t>v121–v122</w:t>
+              <w:t>v121–v123</w:t>
             </w:r>
           </w:p>
         </w:tc>
@@ -3882,13 +3882,10 @@
     </w:p>
     <w:p>
       <w:r>
-        <w:rPr>
-          <w:b/>
-        </w:rPr>
-        <w:t xml:space="preserve">v122: </w:t>
+        <w:t>v122: чат вынесен в верхнюю панель доски, добавлен счётчик новых сообщений и мобильная адаптация; SQL гарантирует публикацию board_comments в Supabase Realtime.</w:t>
       </w:r>
       <w:r>
-        <w:t>чат вынесен в верхнюю панель доски, добавлен счётчик новых сообщений и мобильная адаптация; SQL гарантирует публикацию board_comments в Supabase Realtime.</w:t>
+        <w:t xml:space="preserve"> v123: добавлен отдельный экран личных диалогов преподаватель ↔ ученик вне открытой доски: история в Supabase, непрочитанные сообщения, realtime-обновление и список собеседников из общих досок.</w:t>
       </w:r>
     </w:p>
     <w:sectPr>

</xml_diff>

<commit_message>
v124: finish direct messaging
</commit_message>
<xml_diff>
--- a/supabase/OnlineRepetitor_roadmap.docx
+++ b/supabase/OnlineRepetitor_roadmap.docx
@@ -3385,7 +3385,7 @@
           </w:tcPr>
           <w:p>
             <w:r>
-              <w:t>Личные сообщения преподаватель ↔ ученик работают и внутри доски, и отдельным экраном: история в Supabase, realtime, непрочитанные сообщения и доступ только между участниками общих досок. Осталось довести уведомления и вложения.</w:t>
+              <w:t>Личные сообщения внутри доски и отдельным экраном: Supabase/Realtime, непрочитанные, поиск, редактирование/удаление своих сообщений, отметки прочтения и мобильный интерфейс.</w:t>
             </w:r>
           </w:p>
         </w:tc>
@@ -3393,11 +3393,11 @@
           <w:tcPr>
             <w:tcW w:type="dxa" w:w="1656"/>
             <w:vAlign w:val="center"/>
-            <w:shd w:fill="FFF2CC"/>
+            <w:shd w:fill="D9EAD3"/>
           </w:tcPr>
           <w:p>
             <w:r>
-              <w:t>В РАБОТЕ</w:t>
+              <w:t>ГОТОВО</w:t>
             </w:r>
           </w:p>
         </w:tc>
@@ -3405,11 +3405,11 @@
           <w:tcPr>
             <w:tcW w:type="dxa" w:w="936"/>
             <w:vAlign w:val="center"/>
-            <w:shd w:fill="FFF2CC"/>
+            <w:shd w:fill="D9EAD3"/>
           </w:tcPr>
           <w:p>
             <w:r>
-              <w:t>90%</w:t>
+              <w:t>100%</w:t>
             </w:r>
           </w:p>
         </w:tc>
@@ -3420,7 +3420,7 @@
           </w:tcPr>
           <w:p>
             <w:r>
-              <w:t>v121–v123</w:t>
+              <w:t>v121–v124</w:t>
             </w:r>
           </w:p>
         </w:tc>
@@ -3882,10 +3882,7 @@
     </w:p>
     <w:p>
       <w:r>
-        <w:t>v122: чат вынесен в верхнюю панель доски, добавлен счётчик новых сообщений и мобильная адаптация; SQL гарантирует публикацию board_comments в Supabase Realtime.</w:t>
-      </w:r>
-      <w:r>
-        <w:t xml:space="preserve"> v123: добавлен отдельный экран личных диалогов преподаватель ↔ ученик вне открытой доски: история в Supabase, непрочитанные сообщения, realtime-обновление и список собеседников из общих досок.</w:t>
+        <w:t>v122: чат вынесен в верхнюю панель доски, добавлен счётчик новых сообщений и мобильная адаптация; SQL гарантирует публикацию board_comments в Supabase Realtime. v123: добавлен отдельный экран личных диалогов преподаватель ↔ ученик вне открытой доски: история в Supabase, непрочитанные сообщения, realtime-обновление и список собеседников из общих досок. v124: чат завершён: поиск, редактирование/удаление сообщений и отметки прочтения. Далее — видеозвонки.</w:t>
       </w:r>
     </w:p>
     <w:sectPr>

</xml_diff>

<commit_message>
v125: start WebRTC video calls
</commit_message>
<xml_diff>
--- a/supabase/OnlineRepetitor_roadmap.docx
+++ b/supabase/OnlineRepetitor_roadmap.docx
@@ -3466,16 +3466,8 @@
             <w:vAlign w:val="center"/>
           </w:tcPr>
           <w:p>
-            <w:pPr>
-              <w:spacing w:after="0" w:before="0"/>
-              <w:jc w:val="left"/>
-            </w:pPr>
             <w:r>
-              <w:rPr>
-                <w:rFonts w:ascii="Arial" w:hAnsi="Arial"/>
-                <w:sz w:val="16"/>
-              </w:rPr>
-              <w:t>Встроенный видеозвонок, управление камерой/микрофоном, возможно запись занятия.</w:t>
+              <w:t>Встроенный WebRTC-видеозвонок в личном диалоге: камера и микрофон, принять/отклонить/завершить, отключение камеры/микрофона, Supabase Realtime-сигнализация offer/answer/ICE/hangup, мобильный интерфейс. Для полной сетевой надёжности ещё требуется TURN и дальнейшая интеграция звонков с уроком.</w:t>
             </w:r>
           </w:p>
         </w:tc>
@@ -3483,11 +3475,11 @@
           <w:tcPr>
             <w:tcW w:type="dxa" w:w="1656"/>
             <w:vAlign w:val="center"/>
-            <w:shd w:fill="E7E6E6"/>
+            <w:shd w:fill="FFF2CC"/>
           </w:tcPr>
           <w:p>
             <w:r>
-              <w:t>ПОЗЖЕ</w:t>
+              <w:t>В РАБОТЕ</w:t>
             </w:r>
           </w:p>
         </w:tc>
@@ -3495,19 +3487,11 @@
           <w:tcPr>
             <w:tcW w:type="dxa" w:w="936"/>
             <w:vAlign w:val="center"/>
-            <w:shd w:fill="E7E6E6"/>
+            <w:shd w:fill="FFF2CC"/>
           </w:tcPr>
           <w:p>
-            <w:pPr>
-              <w:spacing w:after="0" w:before="0"/>
-              <w:jc w:val="center"/>
-            </w:pPr>
             <w:r>
-              <w:rPr>
-                <w:rFonts w:ascii="Arial" w:hAnsi="Arial"/>
-                <w:sz w:val="16"/>
-              </w:rPr>
-              <w:t>0%</w:t>
+              <w:t>45%</w:t>
             </w:r>
           </w:p>
         </w:tc>
@@ -3517,16 +3501,8 @@
             <w:vAlign w:val="center"/>
           </w:tcPr>
           <w:p>
-            <w:pPr>
-              <w:spacing w:after="0" w:before="0"/>
-              <w:jc w:val="center"/>
-            </w:pPr>
             <w:r>
-              <w:rPr>
-                <w:rFonts w:ascii="Arial" w:hAnsi="Arial"/>
-                <w:sz w:val="16"/>
-              </w:rPr>
-              <w:t>Дальний этап</w:t>
+              <w:t>v125</w:t>
             </w:r>
           </w:p>
         </w:tc>
@@ -3759,130 +3735,271 @@
       </w:r>
     </w:p>
     <w:p>
+      <w:pPr>
+        <w:spacing w:after="40" w:line="221" w:lineRule="auto"/>
+      </w:pPr>
       <w:r>
+        <w:rPr>
+          <w:sz w:val="14"/>
+        </w:rPr>
         <w:t>v100 · Визуальный редизайн: верхняя панель разгружена, вторичные действия собраны в компактное меню, панель инструментов и всплывающие окна получили единую более лёгкую визуальную систему.</w:t>
       </w:r>
     </w:p>
     <w:p>
+      <w:pPr>
+        <w:spacing w:after="40" w:line="221" w:lineRule="auto"/>
+      </w:pPr>
       <w:r>
+        <w:rPr>
+          <w:sz w:val="14"/>
+        </w:rPr>
         <w:t>v101 · UX доски: исправлена визуальная иерархия после v100, введена единая типографика, основная панель инструментов получила подписи и режим «Ещё инструменты», а пустая доска — понятный стартовый экран с быстрыми действиями.</w:t>
       </w:r>
     </w:p>
     <w:p>
+      <w:pPr>
+        <w:spacing w:after="40" w:line="221" w:lineRule="auto"/>
+      </w:pPr>
       <w:r>
+        <w:rPr>
+          <w:sz w:val="14"/>
+        </w:rPr>
         <w:t>v102 · Панель инструментов: панель ограничена высотой рабочего окна и прокручивается внутри; «Выбрать» и «Двигать» вынесены в отдельный постоянный блок и не исчезают при прокрутке списка.</w:t>
       </w:r>
     </w:p>
     <w:p>
+      <w:pPr>
+        <w:spacing w:after="40" w:line="221" w:lineRule="auto"/>
+      </w:pPr>
       <w:r>
+        <w:rPr>
+          <w:sz w:val="14"/>
+        </w:rPr>
         <w:t>v103 · Панель инструментов возвращена к компактной плавающей колонке. «Выбрать» и «Двигать» закреплены сверху, основные инструменты показаны иконками, дополнительные раскрываются отдельно. Панель больше не занимает широкую полосу рабочего пространства.</w:t>
       </w:r>
     </w:p>
     <w:p>
+      <w:pPr>
+        <w:spacing w:after="40" w:line="221" w:lineRule="auto"/>
+      </w:pPr>
       <w:r>
+        <w:rPr>
+          <w:sz w:val="14"/>
+        </w:rPr>
         <w:t>v104 · Исправлена первопричина выхода панели за верхнюю границу: старое transform: translateY(-50%) продолжало сдвигать панель вверх после редизайна. На desktop трансформация сброшена; панель позиционируется относительно рабочей области с безопасным отступом.</w:t>
       </w:r>
     </w:p>
     <w:p>
+      <w:pPr>
+        <w:spacing w:after="40" w:line="221" w:lineRule="auto"/>
+      </w:pPr>
       <w:r>
+        <w:rPr>
+          <w:sz w:val="14"/>
+        </w:rPr>
         <w:t>v105 · Типографика и телефон: увеличены мелкие подписи верхней панели, меню, подсказок, окон и элементов управления. Установленная PWA закреплена в альбомной ориентации; мобильная доска получила отдельную landscape-компоновку, а в портретном браузерном режиме показывается просьба повернуть телефон.</w:t>
       </w:r>
     </w:p>
     <w:p>
+      <w:pPr>
+        <w:spacing w:after="40" w:line="221" w:lineRule="auto"/>
+      </w:pPr>
       <w:r>
+        <w:rPr>
+          <w:sz w:val="14"/>
+        </w:rPr>
         <w:t>v106 · UX-полировка: убран блокирующий экран с просьбой повернуть телефон; PWA остаётся ориентирована на landscape, но браузерная версия работает в любой ориентации. Главное мобильное меню стало компактнее, навигация — горизонтальной, карточки и фильтры адаптивными. Выпадающие списки получили спокойный серый фон и мягкие состояния. Для интерфейсного текста добавлены переносы и увеличены безопасные области, чтобы подписи не обрезались.</w:t>
       </w:r>
     </w:p>
     <w:p>
+      <w:pPr>
+        <w:spacing w:after="40" w:line="221" w:lineRule="auto"/>
+      </w:pPr>
       <w:r>
+        <w:rPr>
+          <w:sz w:val="14"/>
+        </w:rPr>
         <w:t>v107 · Верхняя панель: убран отдельный логотип «B», кнопка «Доски» расширена и стала самостоятельной точкой возврата. Статусы сохранения и сети получили собственное пространство и больше не должны обрезаться. На мобильных устройствах при открытии доски приложение запрашивает landscape orientation; в установленной PWA блокировка выполняется сразу, в браузере повторяется после первого касания, когда API требует пользовательский жест.</w:t>
       </w:r>
     </w:p>
     <w:p>
+      <w:pPr>
+        <w:spacing w:after="40" w:line="221" w:lineRule="auto"/>
+      </w:pPr>
       <w:r>
+        <w:rPr>
+          <w:sz w:val="14"/>
+        </w:rPr>
         <w:t>v108 · Настройки: экран профиля больше не показывает навигационные вкладки главной страницы. Выход из аккаунта перенесён из главного меню в раздел «Приложение» настроек. Там же появилась кнопка установки PWA, когда браузер предоставляет системный install prompt. Мобильные настройки уплотнены; в landscape карточки раскладываются в две колонки.</w:t>
       </w:r>
     </w:p>
     <w:p>
+      <w:pPr>
+        <w:spacing w:after="40" w:line="221" w:lineRule="auto"/>
+      </w:pPr>
       <w:r>
+        <w:rPr>
+          <w:sz w:val="14"/>
+        </w:rPr>
         <w:t>v109 · Главное меню на телефоне: длинная полоса разделов заменена компактной раскрывающейся кнопкой «Разделы». Внутри — сетка переходов по кабинету и настройкам. Мобильная шапка упрощена, логотип OR скрыт, настройки представлены одной иконкой. Поиск, фильтры, действия и карточки досок уплотнены; landscape-режим использует более плотную трёхколоночную сетку.</w:t>
       </w:r>
     </w:p>
     <w:p>
+      <w:pPr>
+        <w:spacing w:after="40" w:line="221" w:lineRule="auto"/>
+      </w:pPr>
       <w:r>
+        <w:rPr>
+          <w:sz w:val="14"/>
+        </w:rPr>
         <w:t>v110 · Мобильный режим: удалён автоматический переход обычной вкладки Chrome в Fullscreen, который на Android создавал системное уведомление OnlineRepetitor с предложением скопировать URL/открыть страницу в Chrome. Landscape-lock теперь запрашивается только в установленной PWA; manifest сохраняет orientation=landscape. Обычная вкладка браузера больше не переводится приложением в app-like fullscreen.</w:t>
       </w:r>
     </w:p>
     <w:p>
+      <w:pPr>
+        <w:spacing w:after="40" w:line="221" w:lineRule="auto"/>
+      </w:pPr>
       <w:r>
+        <w:rPr>
+          <w:sz w:val="14"/>
+        </w:rPr>
         <w:t>v111 · Комплексный mobile/tablet UX: введены отдельные адаптивные режимы для телефона, компактного и большого планшета. На доске переработаны верхняя панель, нижний док быстрых инструментов, раскрываемая полная палитра, масштаб, настройки пера/ластика/связей/фигур, touch-маркеры выделения, всплывающие окна и safe-area. На планшетах сохранена вертикальная панель инструментов, но увеличены touch-targets и освобождена рабочая область. Кабинетные экраны, материалы, расписание, уведомления, профиль и карточные сетки получили согласованные мобильные и планшетные раскладки.</w:t>
       </w:r>
     </w:p>
     <w:p>
+      <w:pPr>
+        <w:spacing w:after="40" w:line="221" w:lineRule="auto"/>
+      </w:pPr>
       <w:r>
+        <w:rPr>
+          <w:sz w:val="14"/>
+        </w:rPr>
         <w:t>v112 · В приложение добавлен отдельный раздел «🧪 Инструкция тестировщика». Он содержит полный пошаговый QA-прогон: авторизация и роли, кабинет и жизненный цикл досок, все инструменты доски с обозначениями и горячими клавишами, редактирование объектов, совместная работа, Live Lesson и презентация, ученики/задания/прогресс, расписание, материалы и шаблоны, уведомления, профиль, PWA, offline/reconnect, телефон, планшет и viewer-доступ. Для каждого теста указаны шаги и ожидаемый результат; есть поиск, фильтр по ролям, режим «только непроверенные», раскрытие разделов и локально сохраняемый прогресс.</w:t>
       </w:r>
     </w:p>
     <w:p>
+      <w:pPr>
+        <w:spacing w:after="40" w:line="221" w:lineRule="auto"/>
+      </w:pPr>
       <w:r>
+        <w:rPr>
+          <w:sz w:val="14"/>
+        </w:rPr>
         <w:t>v113 · Доступ к доске: кнопки «Поделиться» заменены на «Пригласить». Создание ссылок переработано визуально: отдельные карточки прав «Редактирование» и «Только просмотр», понятные описания, аккуратный блок готовой ссылки и копирования, стилизованные активные приглашения, приглашение по email и список участников. Интерфейс адаптирован для телефона и тёмной темы.</w:t>
       </w:r>
     </w:p>
     <w:p>
+      <w:pPr>
+        <w:spacing w:after="40" w:line="221" w:lineRule="auto"/>
+      </w:pPr>
       <w:r>
+        <w:rPr>
+          <w:sz w:val="14"/>
+        </w:rPr>
         <w:t>v114 · Доступность и скорость: эксперимент с ленивой загрузкой App, отдельным React vendor-chunk и агрессивной стратегией Service Worker. Реальное тестирование без VPN показало ухудшение времени загрузки, поэтому эти изменения не считаются удачным решением и откатываются в v115.</w:t>
       </w:r>
     </w:p>
     <w:p>
+      <w:pPr>
+        <w:spacing w:after="40" w:line="221" w:lineRule="auto"/>
+      </w:pPr>
       <w:r>
+        <w:rPr>
+          <w:sz w:val="14"/>
+        </w:rPr>
         <w:t>v115 · Стабилизация загрузки: удалены дополнительные стартовые сетевые запросы v114, возвращена единая загрузка App и проверенная network-first стратегия для JavaScript/CSS. Убран 3,5-секундный таймаут навигации и HTML-загрузчик. Cache namespace обновлён до v115, чтобы после активации удалить кэш v114. Следующий этап оптимизации будет опираться на измерения реальной задержки, а не на увеличение числа стартовых запросов.</w:t>
       </w:r>
     </w:p>
     <w:p>
+      <w:pPr>
+        <w:spacing w:after="40" w:line="221" w:lineRule="auto"/>
+      </w:pPr>
       <w:r>
+        <w:rPr>
+          <w:sz w:val="14"/>
+        </w:rPr>
         <w:t>v116 · QA и стабилизация: инструкция тестировщика получила серверную отправку багов прямо из каждого теста. Сохраняются проверка, серьёзность, фактический и ожидаемый результат, браузер и размер экрана. Пользователь видит свои отчёты, администратор — общий журнал и может переводить ошибки по статусам «Открыт / В работе / Исправлен / Закрыт».</w:t>
       </w:r>
     </w:p>
     <w:p>
+      <w:pPr>
+        <w:spacing w:after="40" w:line="221" w:lineRule="auto"/>
+      </w:pPr>
       <w:r>
         <w:rPr>
           <w:b/>
+          <w:sz w:val="14"/>
         </w:rPr>
         <w:t>v117 · 25.09.2026 — исправлена интерактивность стартовой карточки «Пустая доска»: кнопки быстрых действий снова принимают клики.</w:t>
       </w:r>
     </w:p>
     <w:p>
+      <w:pPr>
+        <w:spacing w:after="40" w:line="221" w:lineRule="auto"/>
+      </w:pPr>
       <w:r>
+        <w:rPr>
+          <w:sz w:val="14"/>
+        </w:rPr>
         <w:t>v118 · Производительность интерфейса: выполнен безопасный этап оптимизации рендеринга без изменения логики приложения. Снижена стоимость компоновки объектов доски, тяжёлые blur/тени и переходы отключаются при панорамировании, а мобильный/touch-интерфейс использует облегчённые эффекты. Следующий этап — профилирование больших досок и оптимизация частых pointer/realtime-обновлений по результатам замеров.</w:t>
       </w:r>
     </w:p>
     <w:p>
+      <w:pPr>
+        <w:spacing w:after="40" w:line="221" w:lineRule="auto"/>
+      </w:pPr>
       <w:r>
+        <w:rPr>
+          <w:sz w:val="14"/>
+        </w:rPr>
         <w:t>v119 · Надёжность синхронизации: кратковременный сетевой сбой больше не оставляет доску в состоянии «сервер временно недоступен». Локальная копия сохраняется сразу, серверное сохранение автоматически повторяется с увеличивающейся задержкой, а после успешной отправки статус возвращается к «Сохранено на сервере». Повторная попытка всегда отправляет актуальный снимок доски и прекращается при закрытии экрана.</w:t>
       </w:r>
     </w:p>
     <w:p>
+      <w:pPr>
+        <w:spacing w:after="40" w:line="221" w:lineRule="auto"/>
+      </w:pPr>
       <w:r>
         <w:rPr>
           <w:b w:val="0"/>
+          <w:sz w:val="14"/>
         </w:rPr>
         <w:t>v120 · Исправление серверного сохранения новой доски: устранена ошибка в SQL-функции save_board_document, где PL/pgSQL FOUND проверялся после чтения профиля пользователя и мог ошибочно считать несуществующий board_documents уже найденным. Состояние наличия документа теперь фиксируется сразу после SELECT board_documents; первая серверная версия новой доски корректно создаётся, после чего обычная синхронизация продолжает работу.</w:t>
       </w:r>
     </w:p>
     <w:p>
+      <w:pPr>
+        <w:spacing w:after="40" w:line="221" w:lineRule="auto"/>
+      </w:pPr>
       <w:r>
         <w:rPr>
           <w:b/>
+          <w:sz w:val="14"/>
         </w:rPr>
         <w:t xml:space="preserve">v121 · Дальний этап 38: </w:t>
       </w:r>
       <w:r>
+        <w:rPr>
+          <w:sz w:val="14"/>
+        </w:rPr>
         <w:t>начат полноценный чат внутри доски на серверной базе обсуждений: realtime, ответы, @упоминания, счётчик новых сообщений и адаптивное окно. Добавлен индекс для быстрых хронологических чтений.</w:t>
       </w:r>
     </w:p>
     <w:p>
+      <w:pPr>
+        <w:spacing w:after="40" w:line="221" w:lineRule="auto"/>
+      </w:pPr>
       <w:r>
+        <w:rPr>
+          <w:sz w:val="14"/>
+        </w:rPr>
         <w:t>v122: чат вынесен в верхнюю панель доски, добавлен счётчик новых сообщений и мобильная адаптация; SQL гарантирует публикацию board_comments в Supabase Realtime. v123: добавлен отдельный экран личных диалогов преподаватель ↔ ученик вне открытой доски: история в Supabase, непрочитанные сообщения, realtime-обновление и список собеседников из общих досок. v124: чат завершён: поиск, редактирование/удаление сообщений и отметки прочтения. Далее — видеозвонки.</w:t>
+      </w:r>
+      <w:r>
+        <w:rPr>
+          <w:sz w:val="14"/>
+        </w:rPr>
+        <w:t xml:space="preserve"> v125: начат этап видеозвонков — WebRTC камера/микрофон, входящий/исходящий звонок, управление медиа и Supabase Realtime-сигнализация; раздел сообщений возвращён в основную навигацию. Следующий шаг — TURN и интеграция звонка с Live Lesson.</w:t>
       </w:r>
     </w:p>
     <w:sectPr>

</xml_diff>